<commit_message>
Remove unrelated non-project content
</commit_message>
<xml_diff>
--- a/docs/03_AHIP_Responsible_Use_and_Public_Access_Guide_v1.0.docx
+++ b/docs/03_AHIP_Responsible_Use_and_Public_Access_Guide_v1.0.docx
@@ -1027,7 +1027,7 @@
         <w:keepNext/>
       </w:pPr>
       <w:r>
-        <w:t>5. What Will and Will Not Be Shared</w:t>
+        <w:t>5. Public Release Scope</w:t>
       </w:r>
     </w:p>
     <w:tbl>
@@ -1151,61 +1151,6 @@
                 <w:sz w:val="17"/>
               </w:rPr>
               <w:t>Concise AHIP overview; national replication framework; Miami-Dade case study; housing data-source guidance; KPI definitions; data-quality checklist; responsible-AI controls; selected dashboard examples; version notes; feedback instructions.</w:t>
-            </w:r>
-          </w:p>
-        </w:tc>
-      </w:tr>
-      <w:tr>
-        <w:trPr>
-          <w:cantSplit/>
-        </w:trPr>
-        <w:tc>
-          <w:tcPr>
-            <w:tcW w:type="dxa" w:w="1728"/>
-            <w:tcMar>
-              <w:top w:w="60" w:type="dxa"/>
-              <w:start w:w="70" w:type="dxa"/>
-              <w:bottom w:w="60" w:type="dxa"/>
-              <w:end w:w="70" w:type="dxa"/>
-            </w:tcMar>
-            <w:vAlign w:val="top"/>
-            <w:shd w:fill="F2F2F2"/>
-          </w:tcPr>
-          <w:p>
-            <w:pPr>
-              <w:spacing w:after="0" w:line="240" w:lineRule="auto"/>
-            </w:pPr>
-            <w:r>
-              <w:rPr>
-                <w:color w:val="222222"/>
-                <w:sz w:val="17"/>
-              </w:rPr>
-              <w:t>Not public</w:t>
-            </w:r>
-          </w:p>
-        </w:tc>
-        <w:tc>
-          <w:tcPr>
-            <w:tcW w:type="dxa" w:w="8640"/>
-            <w:tcMar>
-              <w:top w:w="60" w:type="dxa"/>
-              <w:start w:w="70" w:type="dxa"/>
-              <w:bottom w:w="60" w:type="dxa"/>
-              <w:end w:w="70" w:type="dxa"/>
-            </w:tcMar>
-            <w:vAlign w:val="top"/>
-            <w:shd w:fill="F2F2F2"/>
-          </w:tcPr>
-          <w:p>
-            <w:pPr>
-              <w:spacing w:after="0" w:line="240" w:lineRule="auto"/>
-            </w:pPr>
-            <w:r>
-              <w:rPr>
-                <w:color w:val="222222"/>
-                <w:sz w:val="17"/>
-              </w:rPr>
-              <w:t>Immigration records; recommendation letters; attorney communications; personal information; employer-confidential material; credentials or passwords; licensed materials that cannot be redistributed; unnecessary raw data; and internal evidence files not needed for public use.</w:t>
             </w:r>
           </w:p>
         </w:tc>
@@ -1580,7 +1525,7 @@
                 <w:color w:val="222222"/>
                 <w:sz w:val="17"/>
               </w:rPr>
-              <w:t>Privacy</w:t>
+              <w:t>Scope control</w:t>
             </w:r>
           </w:p>
         </w:tc>
@@ -1605,7 +1550,7 @@
                 <w:color w:val="222222"/>
                 <w:sz w:val="17"/>
               </w:rPr>
-              <w:t>No personal, immigration, attorney, employer-confidential, or credential information is included.</w:t>
+              <w:t>Only reviewed, project-relevant materials approved for public use are included.</w:t>
             </w:r>
           </w:p>
         </w:tc>

</xml_diff>